<commit_message>
Rapor 5: fine-tune eğitim eğrisi eklendi (history.json)
Co-Authored-By: Claude Fable 5.1 <noreply@anthropic.com>
</commit_message>
<xml_diff>
--- a/docs/reports/05_kismi_fine_tune.docx
+++ b/docs/reports/05_kismi_fine_tune.docx
@@ -42,7 +42,7 @@
         <w:rPr>
           <w:sz w:val="20"/>
         </w:rPr>
-        <w:t>Ethem Belka Şahin · 23.10.2026</w:t>
+        <w:t>Ethem Belka Şahin · 24.10.2026</w:t>
       </w:r>
     </w:p>
     <w:p>
@@ -236,11 +236,59 @@
     </w:p>
     <w:p>
       <w:r>
+        <w:t>8 tur tamamlandı; en iyi val R@1 0.745 (tur 7); tur başına ≈ 2.2 dk.</w:t>
+      </w:r>
+    </w:p>
+    <w:p>
+      <w:pPr>
+        <w:jc w:val="center"/>
+      </w:pPr>
+      <w:r>
+        <w:drawing>
+          <wp:inline xmlns:a="http://schemas.openxmlformats.org/drawingml/2006/main" xmlns:pic="http://schemas.openxmlformats.org/drawingml/2006/picture">
+            <wp:extent cx="5120640" cy="3299968"/>
+            <wp:docPr id="2" name="Picture 2"/>
+            <wp:cNvGraphicFramePr>
+              <a:graphicFrameLocks noChangeAspect="1"/>
+            </wp:cNvGraphicFramePr>
+            <a:graphic>
+              <a:graphicData uri="http://schemas.openxmlformats.org/drawingml/2006/picture">
+                <pic:pic>
+                  <pic:nvPicPr>
+                    <pic:cNvPr id="0" name="training_curve.png"/>
+                    <pic:cNvPicPr/>
+                  </pic:nvPicPr>
+                  <pic:blipFill>
+                    <a:blip r:embed="rId10"/>
+                    <a:stretch>
+                      <a:fillRect/>
+                    </a:stretch>
+                  </pic:blipFill>
+                  <pic:spPr>
+                    <a:xfrm>
+                      <a:off x="0" y="0"/>
+                      <a:ext cx="5120640" cy="3299968"/>
+                    </a:xfrm>
+                    <a:prstGeom prst="rect"/>
+                  </pic:spPr>
+                </pic:pic>
+              </a:graphicData>
+            </a:graphic>
+          </wp:inline>
+        </w:drawing>
+      </w:r>
+    </w:p>
+    <w:p>
+      <w:pPr>
+        <w:jc w:val="center"/>
+      </w:pPr>
+      <w:r>
         <w:rPr>
           <w:i/>
-          <w:color w:val="404040"/>
+          <w:color w:val="52514E"/>
+          <w:sz w:val="18"/>
         </w:rPr>
-        <w:t>Eğitim eğrisi (history.json) henüz Drive'dan indirilmedi; indirilince bu rapora tur tur başarı grafiği eklenecek.</w:t>
+        <w:t>Şekil 2. Tur tur iç doğrulama başarısı.</w:t>
       </w:r>
     </w:p>
     <w:p>
@@ -654,7 +702,7 @@
         <w:drawing>
           <wp:inline xmlns:a="http://schemas.openxmlformats.org/drawingml/2006/main" xmlns:pic="http://schemas.openxmlformats.org/drawingml/2006/picture">
             <wp:extent cx="5486400" cy="2957303"/>
-            <wp:docPr id="2" name="Picture 2"/>
+            <wp:docPr id="3" name="Picture 3"/>
             <wp:cNvGraphicFramePr>
               <a:graphicFrameLocks noChangeAspect="1"/>
             </wp:cNvGraphicFramePr>
@@ -666,7 +714,7 @@
                     <pic:cNvPicPr/>
                   </pic:nvPicPr>
                   <pic:blipFill>
-                    <a:blip r:embed="rId10"/>
+                    <a:blip r:embed="rId11"/>
                     <a:stretch>
                       <a:fillRect/>
                     </a:stretch>
@@ -706,7 +754,7 @@
         <w:drawing>
           <wp:inline xmlns:a="http://schemas.openxmlformats.org/drawingml/2006/main" xmlns:pic="http://schemas.openxmlformats.org/drawingml/2006/picture">
             <wp:extent cx="4754880" cy="1535191"/>
-            <wp:docPr id="3" name="Picture 3"/>
+            <wp:docPr id="4" name="Picture 4"/>
             <wp:cNvGraphicFramePr>
               <a:graphicFrameLocks noChangeAspect="1"/>
             </wp:cNvGraphicFramePr>
@@ -718,7 +766,7 @@
                     <pic:cNvPicPr/>
                   </pic:nvPicPr>
                   <pic:blipFill>
-                    <a:blip r:embed="rId11"/>
+                    <a:blip r:embed="rId12"/>
                     <a:stretch>
                       <a:fillRect/>
                     </a:stretch>
@@ -790,7 +838,7 @@
         <w:drawing>
           <wp:inline xmlns:a="http://schemas.openxmlformats.org/drawingml/2006/main" xmlns:pic="http://schemas.openxmlformats.org/drawingml/2006/picture">
             <wp:extent cx="5852160" cy="3116742"/>
-            <wp:docPr id="4" name="Picture 4"/>
+            <wp:docPr id="5" name="Picture 5"/>
             <wp:cNvGraphicFramePr>
               <a:graphicFrameLocks noChangeAspect="1"/>
             </wp:cNvGraphicFramePr>
@@ -802,7 +850,7 @@
                     <pic:cNvPicPr/>
                   </pic:nvPicPr>
                   <pic:blipFill>
-                    <a:blip r:embed="rId12"/>
+                    <a:blip r:embed="rId13"/>
                     <a:stretch>
                       <a:fillRect/>
                     </a:stretch>
@@ -1188,7 +1236,7 @@
         <w:drawing>
           <wp:inline xmlns:a="http://schemas.openxmlformats.org/drawingml/2006/main" xmlns:pic="http://schemas.openxmlformats.org/drawingml/2006/picture">
             <wp:extent cx="5486400" cy="3181392"/>
-            <wp:docPr id="5" name="Picture 5"/>
+            <wp:docPr id="6" name="Picture 6"/>
             <wp:cNvGraphicFramePr>
               <a:graphicFrameLocks noChangeAspect="1"/>
             </wp:cNvGraphicFramePr>
@@ -1200,7 +1248,7 @@
                     <pic:cNvPicPr/>
                   </pic:nvPicPr>
                   <pic:blipFill>
-                    <a:blip r:embed="rId13"/>
+                    <a:blip r:embed="rId14"/>
                     <a:stretch>
                       <a:fillRect/>
                     </a:stretch>
@@ -1240,7 +1288,7 @@
         <w:drawing>
           <wp:inline xmlns:a="http://schemas.openxmlformats.org/drawingml/2006/main" xmlns:pic="http://schemas.openxmlformats.org/drawingml/2006/picture">
             <wp:extent cx="5303520" cy="3352334"/>
-            <wp:docPr id="6" name="Picture 6"/>
+            <wp:docPr id="7" name="Picture 7"/>
             <wp:cNvGraphicFramePr>
               <a:graphicFrameLocks noChangeAspect="1"/>
             </wp:cNvGraphicFramePr>
@@ -1252,7 +1300,7 @@
                     <pic:cNvPicPr/>
                   </pic:nvPicPr>
                   <pic:blipFill>
-                    <a:blip r:embed="rId14"/>
+                    <a:blip r:embed="rId15"/>
                     <a:stretch>
                       <a:fillRect/>
                     </a:stretch>
@@ -1300,7 +1348,7 @@
         <w:drawing>
           <wp:inline xmlns:a="http://schemas.openxmlformats.org/drawingml/2006/main" xmlns:pic="http://schemas.openxmlformats.org/drawingml/2006/picture">
             <wp:extent cx="5760720" cy="8497184"/>
-            <wp:docPr id="7" name="Picture 7"/>
+            <wp:docPr id="8" name="Picture 8"/>
             <wp:cNvGraphicFramePr>
               <a:graphicFrameLocks noChangeAspect="1"/>
             </wp:cNvGraphicFramePr>
@@ -1312,7 +1360,7 @@
                     <pic:cNvPicPr/>
                   </pic:nvPicPr>
                   <pic:blipFill>
-                    <a:blip r:embed="rId15"/>
+                    <a:blip r:embed="rId16"/>
                     <a:stretch>
                       <a:fillRect/>
                     </a:stretch>

</xml_diff>